<commit_message>
Corrige PNGs da logo com margem de segurança (não recortada)
Os exports encostavam na borda do canvas (ponto verde e ícone).
Script preparar_logos.py gera versões com padding; fonte em flying_logo_source.png.

Co-authored-by: lealzinho30 <lealzinho30@users.noreply.github.com>
</commit_message>
<xml_diff>
--- a/flying/papel_timbrado/TIMBRADO_FLYINGSTUDIO.docx
+++ b/flying/papel_timbrado/TIMBRADO_FLYINGSTUDIO.docx
@@ -70,7 +70,7 @@
     <w:r>
       <w:drawing>
         <wp:inline xmlns:a="http://schemas.openxmlformats.org/drawingml/2006/main" xmlns:pic="http://schemas.openxmlformats.org/drawingml/2006/picture">
-          <wp:extent cx="1260000" cy="491607"/>
+          <wp:extent cx="1260000" cy="565967"/>
           <wp:docPr id="1" name="Picture 1"/>
           <wp:cNvGraphicFramePr>
             <a:graphicFrameLocks noChangeAspect="1"/>
@@ -91,7 +91,7 @@
                 <pic:spPr>
                   <a:xfrm>
                     <a:off x="0" y="0"/>
-                    <a:ext cx="1260000" cy="491607"/>
+                    <a:ext cx="1260000" cy="565967"/>
                   </a:xfrm>
                   <a:prstGeom prst="rect"/>
                 </pic:spPr>

</xml_diff>